<commit_message>
docs: update version control evidence
</commit_message>
<xml_diff>
--- a/docs/#160_Version_Control_Evidence.docx
+++ b/docs/#160_Version_Control_Evidence.docx
@@ -73,13 +73,7 @@
         <w:rPr>
           <w:rFonts w:asciiTheme="minorBidi" w:hAnsiTheme="minorBidi"/>
         </w:rPr>
-        <w:t xml:space="preserve">workflow using short lived branches for individual issues or changes. Branches are created from main and merged through pull requests after review and automated checks. </w:t>
-      </w:r>
-      <w:r>
-        <w:rPr>
-          <w:rFonts w:asciiTheme="minorBidi" w:hAnsiTheme="minorBidi"/>
-        </w:rPr>
-        <w:t>The branches demonstrate the use of issue based naming and short lived task branches</w:t>
+        <w:t>workflow using short lived branches for individual issues or changes. Branches are created from main and merged through pull requests after review and automated checks. The branches demonstrate the use of issue based naming and short lived task branches</w:t>
       </w:r>
       <w:r>
         <w:rPr>
@@ -795,13 +789,7 @@
               <w:rPr>
                 <w:rFonts w:asciiTheme="minorBidi" w:hAnsiTheme="minorBidi"/>
               </w:rPr>
-              <w:t>#2</w:t>
-            </w:r>
-            <w:r>
-              <w:rPr>
-                <w:rFonts w:asciiTheme="minorBidi" w:hAnsiTheme="minorBidi"/>
-              </w:rPr>
-              <w:t>8</w:t>
+              <w:t>#28</w:t>
             </w:r>
           </w:p>
         </w:tc>
@@ -875,13 +863,7 @@
               <w:rPr>
                 <w:rFonts w:asciiTheme="minorBidi" w:hAnsiTheme="minorBidi"/>
               </w:rPr>
-              <w:t>#</w:t>
-            </w:r>
-            <w:r>
-              <w:rPr>
-                <w:rFonts w:asciiTheme="minorBidi" w:hAnsiTheme="minorBidi"/>
-              </w:rPr>
-              <w:t>82</w:t>
+              <w:t>#82</w:t>
             </w:r>
           </w:p>
         </w:tc>
@@ -955,13 +937,7 @@
               <w:rPr>
                 <w:rFonts w:asciiTheme="minorBidi" w:hAnsiTheme="minorBidi"/>
               </w:rPr>
-              <w:t>#</w:t>
-            </w:r>
-            <w:r>
-              <w:rPr>
-                <w:rFonts w:asciiTheme="minorBidi" w:hAnsiTheme="minorBidi"/>
-              </w:rPr>
-              <w:t>83</w:t>
+              <w:t>#83</w:t>
             </w:r>
           </w:p>
         </w:tc>
@@ -1035,13 +1011,7 @@
               <w:rPr>
                 <w:rFonts w:asciiTheme="minorBidi" w:hAnsiTheme="minorBidi"/>
               </w:rPr>
-              <w:t>#</w:t>
-            </w:r>
-            <w:r>
-              <w:rPr>
-                <w:rFonts w:asciiTheme="minorBidi" w:hAnsiTheme="minorBidi"/>
-              </w:rPr>
-              <w:t>89</w:t>
+              <w:t>#89</w:t>
             </w:r>
           </w:p>
         </w:tc>
@@ -1115,13 +1085,7 @@
               <w:rPr>
                 <w:rFonts w:asciiTheme="minorBidi" w:hAnsiTheme="minorBidi"/>
               </w:rPr>
-              <w:t>#</w:t>
-            </w:r>
-            <w:r>
-              <w:rPr>
-                <w:rFonts w:asciiTheme="minorBidi" w:hAnsiTheme="minorBidi"/>
-              </w:rPr>
-              <w:t>98</w:t>
+              <w:t>#98</w:t>
             </w:r>
           </w:p>
         </w:tc>
@@ -1195,13 +1159,7 @@
               <w:rPr>
                 <w:rFonts w:asciiTheme="minorBidi" w:hAnsiTheme="minorBidi"/>
               </w:rPr>
-              <w:t>#</w:t>
-            </w:r>
-            <w:r>
-              <w:rPr>
-                <w:rFonts w:asciiTheme="minorBidi" w:hAnsiTheme="minorBidi"/>
-              </w:rPr>
-              <w:t>113</w:t>
+              <w:t>#113</w:t>
             </w:r>
           </w:p>
         </w:tc>
@@ -1275,13 +1233,7 @@
               <w:rPr>
                 <w:rFonts w:asciiTheme="minorBidi" w:hAnsiTheme="minorBidi"/>
               </w:rPr>
-              <w:t>#</w:t>
-            </w:r>
-            <w:r>
-              <w:rPr>
-                <w:rFonts w:asciiTheme="minorBidi" w:hAnsiTheme="minorBidi"/>
-              </w:rPr>
-              <w:t>194</w:t>
+              <w:t>#194</w:t>
             </w:r>
           </w:p>
         </w:tc>
@@ -1355,13 +1307,7 @@
               <w:rPr>
                 <w:rFonts w:asciiTheme="minorBidi" w:hAnsiTheme="minorBidi"/>
               </w:rPr>
-              <w:t>#</w:t>
-            </w:r>
-            <w:r>
-              <w:rPr>
-                <w:rFonts w:asciiTheme="minorBidi" w:hAnsiTheme="minorBidi"/>
-              </w:rPr>
-              <w:t>198</w:t>
+              <w:t>#198</w:t>
             </w:r>
           </w:p>
         </w:tc>
@@ -1636,13 +1582,7 @@
         <w:rPr>
           <w:rFonts w:asciiTheme="minorBidi" w:hAnsiTheme="minorBidi"/>
         </w:rPr>
-        <w:t>Requirement → GitHub Issue → Branch → Pull Request → Commit → Milestone</w:t>
-      </w:r>
-      <w:r>
-        <w:rPr>
-          <w:rFonts w:asciiTheme="minorBidi" w:hAnsiTheme="minorBidi"/>
-        </w:rPr>
-        <w:t xml:space="preserve"> Completed </w:t>
+        <w:t xml:space="preserve">Requirement → GitHub Issue → Branch → Pull Request → Commit → Milestone Completed </w:t>
       </w:r>
     </w:p>
     <w:p>
@@ -1669,31 +1609,25 @@
         <w:rPr>
           <w:rFonts w:asciiTheme="minorBidi" w:hAnsiTheme="minorBidi"/>
         </w:rPr>
-        <w:t xml:space="preserve">The original plan specified the branch types such as </w:t>
-      </w:r>
-      <w:r>
-        <w:rPr>
-          <w:rFonts w:asciiTheme="minorBidi" w:hAnsiTheme="minorBidi"/>
-        </w:rPr>
-        <w:t>feature/, bugfix/, hotfix/, test/, docs/, and chore/.</w:t>
-      </w:r>
-      <w:r>
-        <w:rPr>
-          <w:rFonts w:asciiTheme="minorBidi" w:hAnsiTheme="minorBidi"/>
-        </w:rPr>
-        <w:t xml:space="preserve"> In practice the repository also contains </w:t>
-      </w:r>
-      <w:r>
-        <w:rPr>
-          <w:rFonts w:asciiTheme="minorBidi" w:hAnsiTheme="minorBidi"/>
-        </w:rPr>
-        <w:t>feat/ and fix/ branches</w:t>
-      </w:r>
-      <w:r>
-        <w:rPr>
-          <w:rFonts w:asciiTheme="minorBidi" w:hAnsiTheme="minorBidi"/>
-        </w:rPr>
-        <w:t>.</w:t>
+        <w:t>The original plan specified the branch types such as feature/, bugfix/, hotfix/, test/, docs/, chore/</w:t>
+      </w:r>
+      <w:r>
+        <w:rPr>
+          <w:rFonts w:asciiTheme="minorBidi" w:hAnsiTheme="minorBidi"/>
+        </w:rPr>
+        <w:t xml:space="preserve"> and fix/</w:t>
+      </w:r>
+      <w:r>
+        <w:rPr>
+          <w:rFonts w:asciiTheme="minorBidi" w:hAnsiTheme="minorBidi"/>
+        </w:rPr>
+        <w:t>. In practice the repository also contains feat/ branches</w:t>
+      </w:r>
+      <w:r>
+        <w:rPr>
+          <w:rFonts w:asciiTheme="minorBidi" w:hAnsiTheme="minorBidi"/>
+        </w:rPr>
+        <w:t xml:space="preserve"> which are outside the documented branch type vocabulary.</w:t>
       </w:r>
     </w:p>
     <w:p>
@@ -1729,7 +1663,7 @@
         <w:rPr>
           <w:rFonts w:asciiTheme="minorBidi" w:hAnsiTheme="minorBidi"/>
         </w:rPr>
-        <w:t>fix/SEN371-157-ci-build-client</w:t>
+        <w:t>feat/175-wire-checkout-place-order</w:t>
       </w:r>
     </w:p>
     <w:p>
@@ -1747,7 +1681,7 @@
         <w:rPr>
           <w:rFonts w:asciiTheme="minorBidi" w:hAnsiTheme="minorBidi"/>
         </w:rPr>
-        <w:t>fix/SEN371-158-eslint</w:t>
+        <w:t>feat/165-checkout-fullname-phone</w:t>
       </w:r>
     </w:p>
     <w:p>
@@ -1766,19 +1700,74 @@
         <w:rPr>
           <w:rFonts w:asciiTheme="minorBidi" w:hAnsiTheme="minorBidi"/>
         </w:rPr>
-        <w:t xml:space="preserve">is is a minor naming divergence from the original documented branch type list. The branches still identify the purpose of the work and follow the projects issue based naming approach. The original plan also specified an example format using </w:t>
-      </w:r>
-      <w:r>
-        <w:rPr>
-          <w:rFonts w:asciiTheme="minorBidi" w:hAnsiTheme="minorBidi"/>
-        </w:rPr>
-        <w:t>&lt;type&gt;/&lt;issue-key&gt;-&lt;description&gt;</w:t>
-      </w:r>
-      <w:r>
-        <w:rPr>
-          <w:rFonts w:asciiTheme="minorBidi" w:hAnsiTheme="minorBidi"/>
-        </w:rPr>
-        <w:t>. Actual branches consistently use issue identifiers and descriptive names,</w:t>
+        <w:t xml:space="preserve">is </w:t>
+      </w:r>
+      <w:r>
+        <w:rPr>
+          <w:rFonts w:asciiTheme="minorBidi" w:hAnsiTheme="minorBidi"/>
+        </w:rPr>
+        <w:t>represents a</w:t>
+      </w:r>
+      <w:r>
+        <w:rPr>
+          <w:rFonts w:asciiTheme="minorBidi" w:hAnsiTheme="minorBidi"/>
+        </w:rPr>
+        <w:t xml:space="preserve"> minor naming divergence from the original documented branch type list. The </w:t>
+      </w:r>
+      <w:r>
+        <w:rPr>
+          <w:rFonts w:asciiTheme="minorBidi" w:hAnsiTheme="minorBidi"/>
+        </w:rPr>
+        <w:t xml:space="preserve">feat/ </w:t>
+      </w:r>
+      <w:r>
+        <w:rPr>
+          <w:rFonts w:asciiTheme="minorBidi" w:hAnsiTheme="minorBidi"/>
+        </w:rPr>
+        <w:t>branch</w:t>
+      </w:r>
+      <w:r>
+        <w:rPr>
+          <w:rFonts w:asciiTheme="minorBidi" w:hAnsiTheme="minorBidi"/>
+        </w:rPr>
+        <w:t>es</w:t>
+      </w:r>
+      <w:r>
+        <w:rPr>
+          <w:rFonts w:asciiTheme="minorBidi" w:hAnsiTheme="minorBidi"/>
+        </w:rPr>
+        <w:t xml:space="preserve"> still </w:t>
+      </w:r>
+      <w:r>
+        <w:rPr>
+          <w:rFonts w:asciiTheme="minorBidi" w:hAnsiTheme="minorBidi"/>
+        </w:rPr>
+        <w:t>identify</w:t>
+      </w:r>
+      <w:r>
+        <w:rPr>
+          <w:rFonts w:asciiTheme="minorBidi" w:hAnsiTheme="minorBidi"/>
+        </w:rPr>
+        <w:t xml:space="preserve"> the purpose of the work and follow</w:t>
+      </w:r>
+      <w:r>
+        <w:rPr>
+          <w:rFonts w:asciiTheme="minorBidi" w:hAnsiTheme="minorBidi"/>
+        </w:rPr>
+        <w:t>s</w:t>
+      </w:r>
+      <w:r>
+        <w:rPr>
+          <w:rFonts w:asciiTheme="minorBidi" w:hAnsiTheme="minorBidi"/>
+        </w:rPr>
+        <w:t xml:space="preserve"> the projects issue based naming approach. The original plan also specified an example format using &lt;type&gt;/&lt;issue-key&gt;-&lt;description&gt;. Actual branches consistently use </w:t>
+      </w:r>
+      <w:r>
+        <w:rPr>
+          <w:rFonts w:asciiTheme="minorBidi" w:hAnsiTheme="minorBidi"/>
+        </w:rPr>
+        <w:lastRenderedPageBreak/>
+        <w:t>issue identifiers and descriptive names,</w:t>
       </w:r>
       <w:r>
         <w:t xml:space="preserve"> </w:t>
@@ -1787,14 +1776,7 @@
         <w:rPr>
           <w:rFonts w:asciiTheme="minorBidi" w:hAnsiTheme="minorBidi"/>
         </w:rPr>
-        <w:t xml:space="preserve">although the exact type vocabulary is broader than originally </w:t>
-      </w:r>
-      <w:r>
-        <w:rPr>
-          <w:rFonts w:asciiTheme="minorBidi" w:hAnsiTheme="minorBidi"/>
-        </w:rPr>
-        <w:lastRenderedPageBreak/>
-        <w:t>documented. No traditional merge commits were found in the final main history. This is consistent with the documented squash only merge strategy.</w:t>
+        <w:t>although the exact type vocabulary is broader than originally documented. No traditional merge commits were found in the final main history. This is consistent with the documented squash only merge strategy.</w:t>
       </w:r>
     </w:p>
     <w:p>
@@ -1834,7 +1816,7 @@
         <w:rPr>
           <w:rFonts w:asciiTheme="minorBidi" w:hAnsiTheme="minorBidi"/>
         </w:rPr>
-        <w:t>The main documented divergence is the use of additional feat/ and fix/ branch prefixes alongside the originally specified branch types.</w:t>
+        <w:t>The main documented divergence is the use of additional feat/ branch prefix alongside the originally specified branch types.</w:t>
       </w:r>
     </w:p>
     <w:p/>

</xml_diff>